<commit_message>
Secrets practice 7 TOIB
</commit_message>
<xml_diff>
--- a/Технологии обеспечения информационной безопасности/Практика/ББМО-01-25 ЖелезняковРА ЛБ2.1.docx
+++ b/Технологии обеспечения информационной безопасности/Практика/ББМО-01-25 ЖелезняковРА ЛБ2.1.docx
@@ -271,23 +271,7 @@
           <w:sz w:val="28"/>
           <w:szCs w:val="28"/>
         </w:rPr>
-        <w:t>Практическое задание №</w:t>
-      </w:r>
-      <w:r>
-        <w:rPr>
-          <w:rFonts w:ascii="Times New Roman" w:hAnsi="Times New Roman" w:cs="Times New Roman"/>
-          <w:sz w:val="28"/>
-          <w:szCs w:val="28"/>
-        </w:rPr>
-        <w:t>2</w:t>
-      </w:r>
-      <w:r>
-        <w:rPr>
-          <w:rFonts w:ascii="Times New Roman" w:hAnsi="Times New Roman" w:cs="Times New Roman"/>
-          <w:sz w:val="28"/>
-          <w:szCs w:val="28"/>
-        </w:rPr>
-        <w:t>.1</w:t>
+        <w:t>Практическое задание №2.1</w:t>
       </w:r>
     </w:p>
     <w:p>
@@ -464,6 +448,7 @@
           <w:lang w:eastAsia="zh-CN"/>
         </w:rPr>
       </w:pPr>
+      <w:proofErr w:type="spellStart"/>
       <w:r>
         <w:rPr>
           <w:rFonts w:ascii="Times New Roman" w:hAnsi="Times New Roman" w:cs="Times New Roman"/>
@@ -471,7 +456,17 @@
           <w:szCs w:val="28"/>
           <w:lang w:eastAsia="zh-CN"/>
         </w:rPr>
-        <w:t>Здольник Владимир Вячеславович</w:t>
+        <w:t>Здольник</w:t>
+      </w:r>
+      <w:proofErr w:type="spellEnd"/>
+      <w:r>
+        <w:rPr>
+          <w:rFonts w:ascii="Times New Roman" w:hAnsi="Times New Roman" w:cs="Times New Roman"/>
+          <w:sz w:val="28"/>
+          <w:szCs w:val="28"/>
+          <w:lang w:eastAsia="zh-CN"/>
+        </w:rPr>
+        <w:t xml:space="preserve"> Владимир Вячеславович</w:t>
       </w:r>
     </w:p>
     <w:p>
@@ -548,19 +543,6 @@
         <w:t>Москва, 2025</w:t>
       </w:r>
     </w:p>
-    <w:p/>
-    <w:p/>
-    <w:p/>
-    <w:p/>
-    <w:p/>
-    <w:p/>
-    <w:p/>
-    <w:p/>
-    <w:p/>
-    <w:p/>
-    <w:p/>
-    <w:p/>
-    <w:p/>
     <w:p/>
     <w:sectPr>
       <w:type w:val="continuous"/>

</xml_diff>